<commit_message>
Update checkpoint 2.1 retrieval logging
</commit_message>
<xml_diff>
--- a/Final_Capstone_Project/Capstone_Checkpoint_2.1/MHerrera_Capstone_Checkpoint_2_1_Worksheet-1.docx
+++ b/Final_Capstone_Project/Capstone_Checkpoint_2.1/MHerrera_Capstone_Checkpoint_2_1_Worksheet-1.docx
@@ -1092,10 +1092,10 @@
                 <w:szCs w:val="24"/>
               </w:rPr>
               <w:drawing>
-                <wp:inline distT="0" distB="0" distL="0" distR="0" wp14:anchorId="5E16E19D" wp14:editId="2EDA2405">
-                  <wp:extent cx="6263640" cy="3120390"/>
-                  <wp:effectExtent l="0" t="0" r="3810" b="3810"/>
-                  <wp:docPr id="757296600" name="Picture 1"/>
+                <wp:inline distT="0" distB="0" distL="0" distR="0" wp14:anchorId="333A21E6" wp14:editId="58334D32">
+                  <wp:extent cx="6263640" cy="3191510"/>
+                  <wp:effectExtent l="0" t="0" r="3810" b="8890"/>
+                  <wp:docPr id="1890757920" name="Picture 1"/>
                   <wp:cNvGraphicFramePr>
                     <a:graphicFrameLocks xmlns:a="http://schemas.openxmlformats.org/drawingml/2006/main" noChangeAspect="1"/>
                   </wp:cNvGraphicFramePr>
@@ -1103,7 +1103,7 @@
                     <a:graphicData uri="http://schemas.openxmlformats.org/drawingml/2006/picture">
                       <pic:pic xmlns:pic="http://schemas.openxmlformats.org/drawingml/2006/picture">
                         <pic:nvPicPr>
-                          <pic:cNvPr id="757296600" name=""/>
+                          <pic:cNvPr id="1890757920" name=""/>
                           <pic:cNvPicPr/>
                         </pic:nvPicPr>
                         <pic:blipFill>
@@ -1115,7 +1115,7 @@
                         <pic:spPr>
                           <a:xfrm>
                             <a:off x="0" y="0"/>
-                            <a:ext cx="6263640" cy="3120390"/>
+                            <a:ext cx="6263640" cy="3191510"/>
                           </a:xfrm>
                           <a:prstGeom prst="rect">
                             <a:avLst/>
@@ -1342,6 +1342,8 @@
             </w:pPr>
             <w:r>
               <w:rPr>
+                <w:b/>
+                <w:bCs/>
                 <w:sz w:val="24"/>
                 <w:szCs w:val="24"/>
               </w:rPr>
@@ -1349,10 +1351,19 @@
             </w:r>
             <w:r>
               <w:rPr>
-                <w:sz w:val="24"/>
-                <w:szCs w:val="24"/>
-              </w:rPr>
-              <w:t>uery:</w:t>
+                <w:b/>
+                <w:bCs/>
+                <w:sz w:val="24"/>
+                <w:szCs w:val="24"/>
+              </w:rPr>
+              <w:t>uery</w:t>
+            </w:r>
+            <w:r>
+              <w:rPr>
+                <w:sz w:val="24"/>
+                <w:szCs w:val="24"/>
+              </w:rPr>
+              <w:t>:</w:t>
             </w:r>
             <w:r>
               <w:rPr>
@@ -1366,24 +1377,240 @@
                 <w:sz w:val="24"/>
                 <w:szCs w:val="24"/>
               </w:rPr>
-              <w:t>"Who was Albert Einstein?"</w:t>
-            </w:r>
-          </w:p>
-          <w:p>
-            <w:pPr>
-              <w:rPr>
-                <w:sz w:val="24"/>
-                <w:szCs w:val="24"/>
-              </w:rPr>
-            </w:pPr>
-            <w:r>
-              <w:rPr>
-                <w:sz w:val="24"/>
-                <w:szCs w:val="24"/>
-              </w:rPr>
-              <w:t>Retrieved results:</w:t>
-            </w:r>
-            <w:r>
+              <w:t>Who was Albert Einstein?"</w:t>
+            </w:r>
+          </w:p>
+          <w:p>
+            <w:pPr>
+              <w:rPr>
+                <w:sz w:val="24"/>
+                <w:szCs w:val="24"/>
+              </w:rPr>
+            </w:pPr>
+            <w:r>
+              <w:rPr>
+                <w:b/>
+                <w:bCs/>
+                <w:sz w:val="24"/>
+                <w:szCs w:val="24"/>
+              </w:rPr>
+              <w:t>Retrieved results</w:t>
+            </w:r>
+            <w:r>
+              <w:rPr>
+                <w:sz w:val="24"/>
+                <w:szCs w:val="24"/>
+              </w:rPr>
+              <w:t>:</w:t>
+            </w:r>
+          </w:p>
+          <w:p>
+            <w:pPr>
+              <w:rPr>
+                <w:sz w:val="24"/>
+                <w:szCs w:val="24"/>
+              </w:rPr>
+            </w:pPr>
+            <w:r>
+              <w:rPr>
+                <w:sz w:val="24"/>
+                <w:szCs w:val="24"/>
+              </w:rPr>
+              <w:t>Albert Einstein was “a German-born theoretical physicist” best known for developing the theory of relativity. The document says:</w:t>
+            </w:r>
+          </w:p>
+          <w:p>
+            <w:pPr>
+              <w:rPr>
+                <w:sz w:val="24"/>
+                <w:szCs w:val="24"/>
+              </w:rPr>
+            </w:pPr>
+            <w:r>
+              <w:rPr>
+                <w:sz w:val="24"/>
+                <w:szCs w:val="24"/>
+              </w:rPr>
+              <w:t>“Albert Einstein (14 March 1879 – 18 April 1955) was a German-born theoretical physicist best known for developing the theory of relativity. Einstein also made important contributions to quantum theory.”</w:t>
+            </w:r>
+          </w:p>
+          <w:p>
+            <w:pPr>
+              <w:rPr>
+                <w:sz w:val="24"/>
+                <w:szCs w:val="24"/>
+              </w:rPr>
+            </w:pPr>
+            <w:r>
+              <w:rPr>
+                <w:sz w:val="24"/>
+                <w:szCs w:val="24"/>
+              </w:rPr>
+              <w:t>It also notes that he received the 1921 Nobel Prize in Physics and is associated with famous ideas like “E = mc².”</w:t>
+            </w:r>
+          </w:p>
+          <w:p>
+            <w:pPr>
+              <w:rPr>
+                <w:b/>
+                <w:bCs/>
+                <w:sz w:val="24"/>
+                <w:szCs w:val="24"/>
+              </w:rPr>
+            </w:pPr>
+            <w:r>
+              <w:rPr>
+                <w:b/>
+                <w:bCs/>
+                <w:sz w:val="24"/>
+                <w:szCs w:val="24"/>
+              </w:rPr>
+              <w:t>Observations:</w:t>
+            </w:r>
+          </w:p>
+          <w:p>
+            <w:pPr>
+              <w:spacing w:after="120"/>
+              <w:rPr>
+                <w:sz w:val="24"/>
+                <w:szCs w:val="24"/>
+              </w:rPr>
+            </w:pPr>
+            <w:r>
+              <w:rPr>
+                <w:sz w:val="24"/>
+                <w:szCs w:val="24"/>
+              </w:rPr>
+              <w:t xml:space="preserve">What worked well? What limitations, challenges, or unexpected retrieval behaviors did you observe? </w:t>
+            </w:r>
+          </w:p>
+          <w:p>
+            <w:pPr>
+              <w:spacing w:after="120"/>
+              <w:rPr>
+                <w:sz w:val="24"/>
+                <w:szCs w:val="24"/>
+              </w:rPr>
+            </w:pPr>
+            <w:r>
+              <w:rPr>
+                <w:b/>
+                <w:bCs/>
+                <w:sz w:val="24"/>
+                <w:szCs w:val="24"/>
+              </w:rPr>
+              <w:t>Query 1 worked well</w:t>
+            </w:r>
+            <w:r>
+              <w:rPr>
+                <w:sz w:val="24"/>
+                <w:szCs w:val="24"/>
+              </w:rPr>
+              <w:t xml:space="preserve">: </w:t>
+            </w:r>
+            <w:r>
+              <w:rPr>
+                <w:sz w:val="24"/>
+                <w:szCs w:val="24"/>
+              </w:rPr>
+              <w:t xml:space="preserve">The </w:t>
+            </w:r>
+            <w:r>
+              <w:rPr>
+                <w:sz w:val="24"/>
+                <w:szCs w:val="24"/>
+              </w:rPr>
+              <w:t xml:space="preserve">solution </w:t>
+            </w:r>
+            <w:r>
+              <w:rPr>
+                <w:sz w:val="24"/>
+                <w:szCs w:val="24"/>
+              </w:rPr>
+              <w:t xml:space="preserve">returned quotes </w:t>
+            </w:r>
+            <w:r>
+              <w:rPr>
+                <w:sz w:val="24"/>
+                <w:szCs w:val="24"/>
+              </w:rPr>
+              <w:t xml:space="preserve">directly </w:t>
+            </w:r>
+            <w:r>
+              <w:rPr>
+                <w:sz w:val="24"/>
+                <w:szCs w:val="24"/>
+              </w:rPr>
+              <w:t xml:space="preserve">from the Wikipedia page. This was a Lexical question, so I </w:t>
+            </w:r>
+            <w:r>
+              <w:rPr>
+                <w:sz w:val="24"/>
+                <w:szCs w:val="24"/>
+              </w:rPr>
+              <w:t xml:space="preserve">was </w:t>
+            </w:r>
+            <w:r>
+              <w:rPr>
+                <w:sz w:val="24"/>
+                <w:szCs w:val="24"/>
+              </w:rPr>
+              <w:t>expect</w:t>
+            </w:r>
+            <w:r>
+              <w:rPr>
+                <w:sz w:val="24"/>
+                <w:szCs w:val="24"/>
+              </w:rPr>
+              <w:t>ing</w:t>
+            </w:r>
+            <w:r>
+              <w:rPr>
+                <w:sz w:val="24"/>
+                <w:szCs w:val="24"/>
+              </w:rPr>
+              <w:t xml:space="preserve"> the BM25 ranking to</w:t>
+            </w:r>
+            <w:r>
+              <w:rPr>
+                <w:sz w:val="24"/>
+                <w:szCs w:val="24"/>
+              </w:rPr>
+              <w:t xml:space="preserve"> have </w:t>
+            </w:r>
+            <w:r>
+              <w:rPr>
+                <w:sz w:val="24"/>
+                <w:szCs w:val="24"/>
+              </w:rPr>
+              <w:t>influence</w:t>
+            </w:r>
+            <w:r>
+              <w:rPr>
+                <w:sz w:val="24"/>
+                <w:szCs w:val="24"/>
+              </w:rPr>
+              <w:t>d</w:t>
+            </w:r>
+            <w:r>
+              <w:rPr>
+                <w:sz w:val="24"/>
+                <w:szCs w:val="24"/>
+              </w:rPr>
+              <w:t xml:space="preserve"> the </w:t>
+            </w:r>
+            <w:r>
+              <w:rPr>
+                <w:sz w:val="24"/>
+                <w:szCs w:val="24"/>
+              </w:rPr>
+              <w:t>output</w:t>
+            </w:r>
+            <w:r>
+              <w:rPr>
+                <w:sz w:val="24"/>
+                <w:szCs w:val="24"/>
+              </w:rPr>
               <w:t xml:space="preserve"> </w:t>
             </w:r>
             <w:r>
@@ -1391,78 +1618,35 @@
                 <w:sz w:val="24"/>
                 <w:szCs w:val="24"/>
               </w:rPr>
-              <w:t xml:space="preserve">Albert Einstein was a German-born theoretical physicist, best known for developing the theory of relativity. He also made major contributions to quantum </w:t>
-            </w:r>
-            <w:proofErr w:type="gramStart"/>
-            <w:r>
-              <w:rPr>
-                <w:sz w:val="24"/>
-                <w:szCs w:val="24"/>
-              </w:rPr>
-              <w:t>theory, and</w:t>
-            </w:r>
-            <w:proofErr w:type="gramEnd"/>
-            <w:r>
-              <w:rPr>
-                <w:sz w:val="24"/>
-                <w:szCs w:val="24"/>
-              </w:rPr>
-              <w:t xml:space="preserve"> received the 1921 Nobel Prize in Physics for his discovery of the law of the photoelectric effect.</w:t>
-            </w:r>
-          </w:p>
-          <w:p>
-            <w:pPr>
-              <w:rPr>
-                <w:sz w:val="24"/>
-                <w:szCs w:val="24"/>
-              </w:rPr>
-            </w:pPr>
-          </w:p>
-          <w:p>
-            <w:pPr>
-              <w:rPr>
-                <w:sz w:val="24"/>
-                <w:szCs w:val="24"/>
-              </w:rPr>
-            </w:pPr>
-            <w:r>
-              <w:rPr>
-                <w:sz w:val="24"/>
-                <w:szCs w:val="24"/>
-              </w:rPr>
-              <w:t>Observations:</w:t>
-            </w:r>
-          </w:p>
-          <w:p>
-            <w:pPr>
-              <w:spacing w:after="120"/>
-              <w:rPr>
-                <w:sz w:val="24"/>
-                <w:szCs w:val="24"/>
-              </w:rPr>
-            </w:pPr>
-            <w:r>
-              <w:rPr>
-                <w:sz w:val="24"/>
-                <w:szCs w:val="24"/>
-              </w:rPr>
-              <w:t xml:space="preserve">What worked well? What limitations, challenges, or unexpected retrieval behaviors did you observe? </w:t>
-            </w:r>
-          </w:p>
-          <w:p>
-            <w:pPr>
-              <w:spacing w:after="120"/>
-              <w:rPr>
-                <w:sz w:val="24"/>
-                <w:szCs w:val="24"/>
-              </w:rPr>
-            </w:pPr>
-            <w:r>
-              <w:rPr>
-                <w:sz w:val="24"/>
-                <w:szCs w:val="24"/>
-              </w:rPr>
-              <w:t>Query 1 worked exceptionally well: the exact entity name triggered a perfect 1.0 lexical match, and the LLM extracted a direct, accurate biography. However, the retriever also pulled tangentially related documents (Max Planck, Niels Bohr) due to co-mention, wasting retrieval slots that could have been more selective.</w:t>
+              <w:t xml:space="preserve">more than the Semantic search. However, my code has a 50/50 weight between the two </w:t>
+            </w:r>
+            <w:r>
+              <w:rPr>
+                <w:sz w:val="24"/>
+                <w:szCs w:val="24"/>
+              </w:rPr>
+              <w:t>search</w:t>
+            </w:r>
+            <w:r>
+              <w:rPr>
+                <w:sz w:val="24"/>
+                <w:szCs w:val="24"/>
+              </w:rPr>
+              <w:t xml:space="preserve"> strategies. Therefore,</w:t>
+            </w:r>
+            <w:r>
+              <w:rPr>
+                <w:sz w:val="24"/>
+                <w:szCs w:val="24"/>
+              </w:rPr>
+              <w:t xml:space="preserve"> I believe both influence the output equally.</w:t>
+            </w:r>
+            <w:r>
+              <w:rPr>
+                <w:sz w:val="24"/>
+                <w:szCs w:val="24"/>
+              </w:rPr>
+              <w:t xml:space="preserve">  </w:t>
             </w:r>
           </w:p>
           <w:p>
@@ -1477,6 +1661,38 @@
         </w:tc>
       </w:tr>
     </w:tbl>
+    <w:p>
+      <w:pPr>
+        <w:rPr>
+          <w:sz w:val="24"/>
+          <w:szCs w:val="24"/>
+        </w:rPr>
+      </w:pPr>
+    </w:p>
+    <w:p>
+      <w:pPr>
+        <w:rPr>
+          <w:sz w:val="24"/>
+          <w:szCs w:val="24"/>
+        </w:rPr>
+      </w:pPr>
+    </w:p>
+    <w:p>
+      <w:pPr>
+        <w:rPr>
+          <w:sz w:val="24"/>
+          <w:szCs w:val="24"/>
+        </w:rPr>
+      </w:pPr>
+    </w:p>
+    <w:p>
+      <w:pPr>
+        <w:rPr>
+          <w:sz w:val="24"/>
+          <w:szCs w:val="24"/>
+        </w:rPr>
+      </w:pPr>
+    </w:p>
     <w:p>
       <w:pPr>
         <w:rPr>
@@ -1526,6 +1742,15 @@
               </w:rPr>
               <w:t>Query 2</w:t>
             </w:r>
+            <w:r>
+              <w:rPr>
+                <w:b/>
+                <w:bCs/>
+                <w:sz w:val="24"/>
+                <w:szCs w:val="24"/>
+              </w:rPr>
+              <w:t xml:space="preserve"> – Semantic Question</w:t>
+            </w:r>
           </w:p>
         </w:tc>
       </w:tr>
@@ -1552,42 +1777,137 @@
             </w:pPr>
             <w:r>
               <w:rPr>
-                <w:sz w:val="24"/>
-                <w:szCs w:val="24"/>
-              </w:rPr>
-              <w:t>Query:</w:t>
-            </w:r>
-          </w:p>
-          <w:p>
-            <w:pPr>
-              <w:rPr>
-                <w:sz w:val="24"/>
-                <w:szCs w:val="24"/>
-              </w:rPr>
-            </w:pPr>
-          </w:p>
-          <w:p>
-            <w:pPr>
-              <w:rPr>
-                <w:sz w:val="24"/>
-                <w:szCs w:val="24"/>
-              </w:rPr>
-            </w:pPr>
-            <w:r>
-              <w:rPr>
-                <w:sz w:val="24"/>
-                <w:szCs w:val="24"/>
-              </w:rPr>
-              <w:t>Retrieved results:</w:t>
-            </w:r>
-          </w:p>
-          <w:p>
-            <w:pPr>
-              <w:rPr>
-                <w:sz w:val="24"/>
-                <w:szCs w:val="24"/>
-              </w:rPr>
-            </w:pPr>
+                <w:b/>
+                <w:bCs/>
+                <w:sz w:val="24"/>
+                <w:szCs w:val="24"/>
+              </w:rPr>
+              <w:t>Query</w:t>
+            </w:r>
+            <w:r>
+              <w:rPr>
+                <w:sz w:val="24"/>
+                <w:szCs w:val="24"/>
+              </w:rPr>
+              <w:t>:</w:t>
+            </w:r>
+            <w:r>
+              <w:rPr>
+                <w:sz w:val="24"/>
+                <w:szCs w:val="24"/>
+              </w:rPr>
+              <w:t xml:space="preserve"> </w:t>
+            </w:r>
+            <w:r>
+              <w:rPr>
+                <w:sz w:val="24"/>
+                <w:szCs w:val="24"/>
+              </w:rPr>
+              <w:t xml:space="preserve">How is Ace Bailey related to Toronto Maple </w:t>
+            </w:r>
+            <w:proofErr w:type="spellStart"/>
+            <w:r>
+              <w:rPr>
+                <w:sz w:val="24"/>
+                <w:szCs w:val="24"/>
+              </w:rPr>
+              <w:t>Leafs</w:t>
+            </w:r>
+            <w:proofErr w:type="spellEnd"/>
+            <w:r>
+              <w:rPr>
+                <w:sz w:val="24"/>
+                <w:szCs w:val="24"/>
+              </w:rPr>
+              <w:t>?</w:t>
+            </w:r>
+          </w:p>
+          <w:p>
+            <w:pPr>
+              <w:rPr>
+                <w:sz w:val="24"/>
+                <w:szCs w:val="24"/>
+              </w:rPr>
+            </w:pPr>
+            <w:r>
+              <w:rPr>
+                <w:b/>
+                <w:bCs/>
+                <w:sz w:val="24"/>
+                <w:szCs w:val="24"/>
+              </w:rPr>
+              <w:t>Retrieved results</w:t>
+            </w:r>
+            <w:r>
+              <w:rPr>
+                <w:sz w:val="24"/>
+                <w:szCs w:val="24"/>
+              </w:rPr>
+              <w:t>:</w:t>
+            </w:r>
+          </w:p>
+          <w:p>
+            <w:pPr>
+              <w:rPr>
+                <w:sz w:val="24"/>
+                <w:szCs w:val="24"/>
+              </w:rPr>
+            </w:pPr>
+            <w:r>
+              <w:rPr>
+                <w:sz w:val="24"/>
+                <w:szCs w:val="24"/>
+              </w:rPr>
+              <w:t xml:space="preserve">Ace Bailey is a Toronto Maple </w:t>
+            </w:r>
+            <w:proofErr w:type="spellStart"/>
+            <w:r>
+              <w:rPr>
+                <w:sz w:val="24"/>
+                <w:szCs w:val="24"/>
+              </w:rPr>
+              <w:t>Leafs</w:t>
+            </w:r>
+            <w:proofErr w:type="spellEnd"/>
+            <w:r>
+              <w:rPr>
+                <w:sz w:val="24"/>
+                <w:szCs w:val="24"/>
+              </w:rPr>
+              <w:t xml:space="preserve"> player whose number was retired. The document says he was a Maple </w:t>
+            </w:r>
+            <w:proofErr w:type="spellStart"/>
+            <w:r>
+              <w:rPr>
+                <w:sz w:val="24"/>
+                <w:szCs w:val="24"/>
+              </w:rPr>
+              <w:t>Leafs</w:t>
+            </w:r>
+            <w:proofErr w:type="spellEnd"/>
+            <w:r>
+              <w:rPr>
+                <w:sz w:val="24"/>
+                <w:szCs w:val="24"/>
+              </w:rPr>
+              <w:t xml:space="preserve"> forward and that “The </w:t>
+            </w:r>
+            <w:proofErr w:type="spellStart"/>
+            <w:r>
+              <w:rPr>
+                <w:sz w:val="24"/>
+                <w:szCs w:val="24"/>
+              </w:rPr>
+              <w:t>Leafs</w:t>
+            </w:r>
+            <w:proofErr w:type="spellEnd"/>
+            <w:r>
+              <w:rPr>
+                <w:sz w:val="24"/>
+                <w:szCs w:val="24"/>
+              </w:rPr>
+              <w:t xml:space="preserve"> held the Ace Bailey Benefit Game, the NHL’s first All-Star Game,” and in the retired numbers list: “6 Ace Bailey RW 1926–1933 … retired.”</w:t>
+            </w:r>
           </w:p>
           <w:p>
             <w:pPr>
@@ -1617,8 +1937,131 @@
                 <w:sz w:val="24"/>
                 <w:szCs w:val="24"/>
               </w:rPr>
-              <w:lastRenderedPageBreak/>
               <w:t xml:space="preserve">What worked well? What limitations, challenges, or unexpected retrieval behaviors did you observe? </w:t>
+            </w:r>
+          </w:p>
+          <w:p>
+            <w:pPr>
+              <w:spacing w:after="120"/>
+              <w:rPr>
+                <w:sz w:val="24"/>
+                <w:szCs w:val="24"/>
+              </w:rPr>
+            </w:pPr>
+            <w:r>
+              <w:rPr>
+                <w:b/>
+                <w:bCs/>
+                <w:sz w:val="24"/>
+                <w:szCs w:val="24"/>
+              </w:rPr>
+              <w:t xml:space="preserve">Query </w:t>
+            </w:r>
+            <w:r>
+              <w:rPr>
+                <w:b/>
+                <w:bCs/>
+                <w:sz w:val="24"/>
+                <w:szCs w:val="24"/>
+              </w:rPr>
+              <w:t>2</w:t>
+            </w:r>
+            <w:r>
+              <w:rPr>
+                <w:b/>
+                <w:bCs/>
+                <w:sz w:val="24"/>
+                <w:szCs w:val="24"/>
+              </w:rPr>
+              <w:t xml:space="preserve"> </w:t>
+            </w:r>
+            <w:r>
+              <w:rPr>
+                <w:b/>
+                <w:bCs/>
+                <w:sz w:val="24"/>
+                <w:szCs w:val="24"/>
+              </w:rPr>
+              <w:t xml:space="preserve">also </w:t>
+            </w:r>
+            <w:r>
+              <w:rPr>
+                <w:b/>
+                <w:bCs/>
+                <w:sz w:val="24"/>
+                <w:szCs w:val="24"/>
+              </w:rPr>
+              <w:t>worked well</w:t>
+            </w:r>
+            <w:r>
+              <w:rPr>
+                <w:sz w:val="24"/>
+                <w:szCs w:val="24"/>
+              </w:rPr>
+              <w:t xml:space="preserve">: </w:t>
+            </w:r>
+            <w:r>
+              <w:rPr>
+                <w:sz w:val="24"/>
+                <w:szCs w:val="24"/>
+              </w:rPr>
+              <w:t>The solution returned quotes directly from the Wikipedia page</w:t>
+            </w:r>
+            <w:r>
+              <w:rPr>
+                <w:sz w:val="24"/>
+                <w:szCs w:val="24"/>
+              </w:rPr>
+              <w:t>.</w:t>
+            </w:r>
+            <w:r>
+              <w:rPr>
+                <w:sz w:val="24"/>
+                <w:szCs w:val="24"/>
+              </w:rPr>
+              <w:t xml:space="preserve"> This was a </w:t>
+            </w:r>
+            <w:r>
+              <w:rPr>
+                <w:sz w:val="24"/>
+                <w:szCs w:val="24"/>
+              </w:rPr>
+              <w:t>semantic</w:t>
+            </w:r>
+            <w:r>
+              <w:rPr>
+                <w:sz w:val="24"/>
+                <w:szCs w:val="24"/>
+              </w:rPr>
+              <w:t xml:space="preserve"> question, so I was expecting the </w:t>
+            </w:r>
+            <w:r>
+              <w:rPr>
+                <w:sz w:val="24"/>
+                <w:szCs w:val="24"/>
+              </w:rPr>
+              <w:t>Chroma DB embedding indexing</w:t>
+            </w:r>
+            <w:r>
+              <w:rPr>
+                <w:sz w:val="24"/>
+                <w:szCs w:val="24"/>
+              </w:rPr>
+              <w:t xml:space="preserve"> to have influenced the output more than the </w:t>
+            </w:r>
+            <w:r>
+              <w:rPr>
+                <w:sz w:val="24"/>
+                <w:szCs w:val="24"/>
+              </w:rPr>
+              <w:t>BM25</w:t>
+            </w:r>
+            <w:r>
+              <w:rPr>
+                <w:sz w:val="24"/>
+                <w:szCs w:val="24"/>
+              </w:rPr>
+              <w:t xml:space="preserve"> search. However, my code has a 50/50 weight between the two search strategies. Therefore, I believe both influence the output equally.  </w:t>
             </w:r>
           </w:p>
           <w:p>
@@ -1642,6 +2085,15 @@
         </w:tc>
       </w:tr>
     </w:tbl>
+    <w:p/>
+    <w:p/>
+    <w:p/>
+    <w:p/>
+    <w:p/>
+    <w:p/>
+    <w:p/>
+    <w:p/>
+    <w:p/>
     <w:p/>
     <w:tbl>
       <w:tblPr>
@@ -1682,7 +2134,17 @@
                 <w:sz w:val="24"/>
                 <w:szCs w:val="24"/>
               </w:rPr>
+              <w:lastRenderedPageBreak/>
               <w:t>Query 3</w:t>
+            </w:r>
+            <w:r>
+              <w:rPr>
+                <w:b/>
+                <w:bCs/>
+                <w:sz w:val="24"/>
+                <w:szCs w:val="24"/>
+              </w:rPr>
+              <w:t xml:space="preserve"> – Paraphrased Question</w:t>
             </w:r>
           </w:p>
         </w:tc>
@@ -1710,56 +2172,144 @@
             </w:pPr>
             <w:r>
               <w:rPr>
-                <w:sz w:val="24"/>
-                <w:szCs w:val="24"/>
-              </w:rPr>
-              <w:t>Query:</w:t>
-            </w:r>
-          </w:p>
-          <w:p>
-            <w:pPr>
-              <w:rPr>
-                <w:sz w:val="24"/>
-                <w:szCs w:val="24"/>
-              </w:rPr>
-            </w:pPr>
-          </w:p>
-          <w:p>
-            <w:pPr>
-              <w:rPr>
-                <w:sz w:val="24"/>
-                <w:szCs w:val="24"/>
-              </w:rPr>
-            </w:pPr>
-            <w:r>
-              <w:rPr>
-                <w:sz w:val="24"/>
-                <w:szCs w:val="24"/>
-              </w:rPr>
-              <w:t>Retrieved results:</w:t>
-            </w:r>
-          </w:p>
-          <w:p>
-            <w:pPr>
-              <w:rPr>
-                <w:sz w:val="24"/>
-                <w:szCs w:val="24"/>
-              </w:rPr>
-            </w:pPr>
-          </w:p>
-          <w:p>
-            <w:pPr>
-              <w:rPr>
-                <w:sz w:val="24"/>
-                <w:szCs w:val="24"/>
-              </w:rPr>
-            </w:pPr>
-            <w:r>
-              <w:rPr>
-                <w:sz w:val="24"/>
-                <w:szCs w:val="24"/>
-              </w:rPr>
-              <w:t>Observations:</w:t>
+                <w:b/>
+                <w:bCs/>
+                <w:sz w:val="24"/>
+                <w:szCs w:val="24"/>
+              </w:rPr>
+              <w:t>Query</w:t>
+            </w:r>
+            <w:r>
+              <w:rPr>
+                <w:sz w:val="24"/>
+                <w:szCs w:val="24"/>
+              </w:rPr>
+              <w:t>:</w:t>
+            </w:r>
+            <w:r>
+              <w:rPr>
+                <w:sz w:val="24"/>
+                <w:szCs w:val="24"/>
+              </w:rPr>
+              <w:t xml:space="preserve"> </w:t>
+            </w:r>
+            <w:r>
+              <w:rPr>
+                <w:sz w:val="24"/>
+                <w:szCs w:val="24"/>
+              </w:rPr>
+              <w:t xml:space="preserve">According to </w:t>
+            </w:r>
+            <w:proofErr w:type="gramStart"/>
+            <w:r>
+              <w:rPr>
+                <w:sz w:val="24"/>
+                <w:szCs w:val="24"/>
+              </w:rPr>
+              <w:t>the Wikipedia</w:t>
+            </w:r>
+            <w:proofErr w:type="gramEnd"/>
+            <w:r>
+              <w:rPr>
+                <w:sz w:val="24"/>
+                <w:szCs w:val="24"/>
+              </w:rPr>
+              <w:t xml:space="preserve"> pages, how many weapons are featured in the video game '</w:t>
+            </w:r>
+            <w:proofErr w:type="spellStart"/>
+            <w:r>
+              <w:rPr>
+                <w:sz w:val="24"/>
+                <w:szCs w:val="24"/>
+              </w:rPr>
+              <w:t>GoldenEye</w:t>
+            </w:r>
+            <w:proofErr w:type="spellEnd"/>
+            <w:r>
+              <w:rPr>
+                <w:sz w:val="24"/>
+                <w:szCs w:val="24"/>
+              </w:rPr>
+              <w:t xml:space="preserve"> 007'</w:t>
+            </w:r>
+          </w:p>
+          <w:p>
+            <w:pPr>
+              <w:rPr>
+                <w:sz w:val="24"/>
+                <w:szCs w:val="24"/>
+              </w:rPr>
+            </w:pPr>
+            <w:r>
+              <w:rPr>
+                <w:b/>
+                <w:bCs/>
+                <w:sz w:val="24"/>
+                <w:szCs w:val="24"/>
+              </w:rPr>
+              <w:t>Retrieved results</w:t>
+            </w:r>
+            <w:r>
+              <w:rPr>
+                <w:sz w:val="24"/>
+                <w:szCs w:val="24"/>
+              </w:rPr>
+              <w:t>:</w:t>
+            </w:r>
+          </w:p>
+          <w:p>
+            <w:pPr>
+              <w:rPr>
+                <w:sz w:val="24"/>
+                <w:szCs w:val="24"/>
+              </w:rPr>
+            </w:pPr>
+            <w:r>
+              <w:rPr>
+                <w:sz w:val="24"/>
+                <w:szCs w:val="24"/>
+              </w:rPr>
+              <w:t>According to the **</w:t>
+            </w:r>
+            <w:proofErr w:type="spellStart"/>
+            <w:r>
+              <w:rPr>
+                <w:sz w:val="24"/>
+                <w:szCs w:val="24"/>
+              </w:rPr>
+              <w:t>GoldenEye</w:t>
+            </w:r>
+            <w:proofErr w:type="spellEnd"/>
+            <w:r>
+              <w:rPr>
+                <w:sz w:val="24"/>
+                <w:szCs w:val="24"/>
+              </w:rPr>
+              <w:t xml:space="preserve"> 007** Wikipedia page, the game features **more than 20 weapons**: “**The game features more than 20 weapons**,” including pistols, submachine guns, assault rifles, a sniper rifle, grenades, and throwing knives.</w:t>
+            </w:r>
+          </w:p>
+          <w:p>
+            <w:pPr>
+              <w:rPr>
+                <w:sz w:val="24"/>
+                <w:szCs w:val="24"/>
+              </w:rPr>
+            </w:pPr>
+            <w:r>
+              <w:rPr>
+                <w:b/>
+                <w:bCs/>
+                <w:sz w:val="24"/>
+                <w:szCs w:val="24"/>
+              </w:rPr>
+              <w:t>Observations</w:t>
+            </w:r>
+            <w:r>
+              <w:rPr>
+                <w:sz w:val="24"/>
+                <w:szCs w:val="24"/>
+              </w:rPr>
+              <w:t>:</w:t>
             </w:r>
           </w:p>
           <w:p>
@@ -1786,6 +2336,114 @@
                 <w:szCs w:val="24"/>
               </w:rPr>
             </w:pPr>
+            <w:r>
+              <w:rPr>
+                <w:b/>
+                <w:bCs/>
+                <w:sz w:val="24"/>
+                <w:szCs w:val="24"/>
+              </w:rPr>
+              <w:t xml:space="preserve">Query </w:t>
+            </w:r>
+            <w:r>
+              <w:rPr>
+                <w:b/>
+                <w:bCs/>
+                <w:sz w:val="24"/>
+                <w:szCs w:val="24"/>
+              </w:rPr>
+              <w:t>3</w:t>
+            </w:r>
+            <w:r>
+              <w:rPr>
+                <w:b/>
+                <w:bCs/>
+                <w:sz w:val="24"/>
+                <w:szCs w:val="24"/>
+              </w:rPr>
+              <w:t xml:space="preserve"> </w:t>
+            </w:r>
+            <w:r>
+              <w:rPr>
+                <w:b/>
+                <w:bCs/>
+                <w:sz w:val="24"/>
+                <w:szCs w:val="24"/>
+              </w:rPr>
+              <w:t xml:space="preserve">also </w:t>
+            </w:r>
+            <w:r>
+              <w:rPr>
+                <w:b/>
+                <w:bCs/>
+                <w:sz w:val="24"/>
+                <w:szCs w:val="24"/>
+              </w:rPr>
+              <w:t>worked well</w:t>
+            </w:r>
+            <w:r>
+              <w:rPr>
+                <w:sz w:val="24"/>
+                <w:szCs w:val="24"/>
+              </w:rPr>
+              <w:t xml:space="preserve">: </w:t>
+            </w:r>
+            <w:r>
+              <w:rPr>
+                <w:sz w:val="24"/>
+                <w:szCs w:val="24"/>
+              </w:rPr>
+              <w:t>Same results as with Query 1 and Query 2. T</w:t>
+            </w:r>
+            <w:r>
+              <w:rPr>
+                <w:sz w:val="24"/>
+                <w:szCs w:val="24"/>
+              </w:rPr>
+              <w:t xml:space="preserve">he solution returned </w:t>
+            </w:r>
+            <w:r>
+              <w:rPr>
+                <w:sz w:val="24"/>
+                <w:szCs w:val="24"/>
+              </w:rPr>
+              <w:t xml:space="preserve">the correct </w:t>
+            </w:r>
+            <w:r>
+              <w:rPr>
+                <w:sz w:val="24"/>
+                <w:szCs w:val="24"/>
+              </w:rPr>
+              <w:t xml:space="preserve">quotes </w:t>
+            </w:r>
+            <w:r>
+              <w:rPr>
+                <w:sz w:val="24"/>
+                <w:szCs w:val="24"/>
+              </w:rPr>
+              <w:t xml:space="preserve">and </w:t>
+            </w:r>
+            <w:r>
+              <w:rPr>
+                <w:sz w:val="24"/>
+                <w:szCs w:val="24"/>
+              </w:rPr>
+              <w:t xml:space="preserve">directly from the Wikipedia page This was a </w:t>
+            </w:r>
+            <w:r>
+              <w:rPr>
+                <w:sz w:val="24"/>
+                <w:szCs w:val="24"/>
+              </w:rPr>
+              <w:t>paraphrased</w:t>
+            </w:r>
+            <w:r>
+              <w:rPr>
+                <w:sz w:val="24"/>
+                <w:szCs w:val="24"/>
+              </w:rPr>
+              <w:t xml:space="preserve"> question, so I was expecting the Chroma DB embedding indexing to have influenced the output more than the BM25 search.  </w:t>
+            </w:r>
           </w:p>
           <w:p>
             <w:pPr>
@@ -1799,6 +2457,16 @@
         </w:tc>
       </w:tr>
     </w:tbl>
+    <w:p/>
+    <w:p/>
+    <w:p/>
+    <w:p/>
+    <w:p/>
+    <w:p/>
+    <w:p/>
+    <w:p/>
+    <w:p/>
+    <w:p/>
     <w:p/>
     <w:tbl>
       <w:tblPr>
@@ -1839,7 +2507,44 @@
                 <w:sz w:val="24"/>
                 <w:szCs w:val="24"/>
               </w:rPr>
-              <w:t>Optional Additional Queries</w:t>
+              <w:lastRenderedPageBreak/>
+              <w:t xml:space="preserve">Query </w:t>
+            </w:r>
+            <w:r>
+              <w:rPr>
+                <w:b/>
+                <w:bCs/>
+                <w:sz w:val="24"/>
+                <w:szCs w:val="24"/>
+              </w:rPr>
+              <w:t>4</w:t>
+            </w:r>
+            <w:r>
+              <w:rPr>
+                <w:b/>
+                <w:bCs/>
+                <w:sz w:val="24"/>
+                <w:szCs w:val="24"/>
+              </w:rPr>
+              <w:t xml:space="preserve"> – </w:t>
+            </w:r>
+            <w:r>
+              <w:rPr>
+                <w:b/>
+                <w:bCs/>
+                <w:sz w:val="24"/>
+                <w:szCs w:val="24"/>
+              </w:rPr>
+              <w:t>Summary</w:t>
+            </w:r>
+            <w:r>
+              <w:rPr>
+                <w:b/>
+                <w:bCs/>
+                <w:sz w:val="24"/>
+                <w:szCs w:val="24"/>
+              </w:rPr>
+              <w:t xml:space="preserve"> Question</w:t>
             </w:r>
           </w:p>
         </w:tc>
@@ -1867,19 +2572,37 @@
             </w:pPr>
             <w:r>
               <w:rPr>
-                <w:sz w:val="24"/>
-                <w:szCs w:val="24"/>
-              </w:rPr>
-              <w:t>Query:</w:t>
-            </w:r>
-          </w:p>
-          <w:p>
-            <w:pPr>
-              <w:rPr>
-                <w:sz w:val="24"/>
-                <w:szCs w:val="24"/>
-              </w:rPr>
-            </w:pPr>
+                <w:b/>
+                <w:bCs/>
+                <w:sz w:val="24"/>
+                <w:szCs w:val="24"/>
+              </w:rPr>
+              <w:t>Query</w:t>
+            </w:r>
+            <w:r>
+              <w:rPr>
+                <w:sz w:val="24"/>
+                <w:szCs w:val="24"/>
+              </w:rPr>
+              <w:t>:</w:t>
+            </w:r>
+            <w:r>
+              <w:rPr>
+                <w:rFonts w:ascii="Consolas" w:hAnsi="Consolas" w:cs="Times New Roman"/>
+                <w:color w:val="A5D6FF"/>
+                <w:sz w:val="21"/>
+                <w:szCs w:val="21"/>
+                <w:lang w:eastAsia="en-US"/>
+              </w:rPr>
+              <w:t xml:space="preserve"> </w:t>
+            </w:r>
+            <w:r>
+              <w:rPr>
+                <w:sz w:val="24"/>
+                <w:szCs w:val="24"/>
+              </w:rPr>
+              <w:t>Provide a short summary of the accomplishments of Abraham Lincoln?</w:t>
+            </w:r>
           </w:p>
           <w:p>
             <w:pPr>
@@ -1903,16 +2626,27 @@
                 <w:szCs w:val="24"/>
               </w:rPr>
             </w:pPr>
-          </w:p>
-          <w:p>
-            <w:pPr>
-              <w:rPr>
-                <w:sz w:val="24"/>
-                <w:szCs w:val="24"/>
-              </w:rPr>
-            </w:pPr>
-            <w:r>
-              <w:rPr>
+            <w:r>
+              <w:rPr>
+                <w:sz w:val="24"/>
+                <w:szCs w:val="24"/>
+              </w:rPr>
+              <w:t>Abraham Lincoln “led the United States through the American Civil War,” helped preserve the Union, and played “a major role in the abolition of slavery.” The document says he issued the Emancipation Proclamation, promoted the Thirteenth Amendment, and “following his re-election in 1864, he sought to heal the war-torn nation through Reconstruction.” It also notes that he “closely supervised the Union’s strategy and tactics” during the war.</w:t>
+            </w:r>
+          </w:p>
+          <w:p>
+            <w:pPr>
+              <w:rPr>
+                <w:b/>
+                <w:bCs/>
+                <w:sz w:val="24"/>
+                <w:szCs w:val="24"/>
+              </w:rPr>
+            </w:pPr>
+            <w:r>
+              <w:rPr>
+                <w:b/>
+                <w:bCs/>
                 <w:sz w:val="24"/>
                 <w:szCs w:val="24"/>
               </w:rPr>
@@ -1933,6 +2667,116 @@
                 <w:szCs w:val="24"/>
               </w:rPr>
               <w:t xml:space="preserve">What worked well? What limitations, challenges, or unexpected retrieval behaviors did you observe? </w:t>
+            </w:r>
+          </w:p>
+          <w:p>
+            <w:pPr>
+              <w:spacing w:after="120"/>
+              <w:rPr>
+                <w:sz w:val="24"/>
+                <w:szCs w:val="24"/>
+              </w:rPr>
+            </w:pPr>
+            <w:r>
+              <w:rPr>
+                <w:b/>
+                <w:bCs/>
+                <w:sz w:val="24"/>
+                <w:szCs w:val="24"/>
+              </w:rPr>
+              <w:t xml:space="preserve">Query </w:t>
+            </w:r>
+            <w:r>
+              <w:rPr>
+                <w:b/>
+                <w:bCs/>
+                <w:sz w:val="24"/>
+                <w:szCs w:val="24"/>
+              </w:rPr>
+              <w:t>4</w:t>
+            </w:r>
+            <w:r>
+              <w:rPr>
+                <w:b/>
+                <w:bCs/>
+                <w:sz w:val="24"/>
+                <w:szCs w:val="24"/>
+              </w:rPr>
+              <w:t xml:space="preserve"> </w:t>
+            </w:r>
+            <w:r>
+              <w:rPr>
+                <w:b/>
+                <w:bCs/>
+                <w:sz w:val="24"/>
+                <w:szCs w:val="24"/>
+              </w:rPr>
+              <w:t xml:space="preserve">also </w:t>
+            </w:r>
+            <w:r>
+              <w:rPr>
+                <w:b/>
+                <w:bCs/>
+                <w:sz w:val="24"/>
+                <w:szCs w:val="24"/>
+              </w:rPr>
+              <w:t>worked well</w:t>
+            </w:r>
+            <w:r>
+              <w:rPr>
+                <w:sz w:val="24"/>
+                <w:szCs w:val="24"/>
+              </w:rPr>
+              <w:t xml:space="preserve">: </w:t>
+            </w:r>
+            <w:r>
+              <w:rPr>
+                <w:sz w:val="24"/>
+                <w:szCs w:val="24"/>
+              </w:rPr>
+              <w:t xml:space="preserve">Same results as with </w:t>
+            </w:r>
+            <w:r>
+              <w:rPr>
+                <w:sz w:val="24"/>
+                <w:szCs w:val="24"/>
+              </w:rPr>
+              <w:t>the other queries</w:t>
+            </w:r>
+            <w:r>
+              <w:rPr>
+                <w:sz w:val="24"/>
+                <w:szCs w:val="24"/>
+              </w:rPr>
+              <w:t xml:space="preserve">. The solution returned quotes </w:t>
+            </w:r>
+            <w:r>
+              <w:rPr>
+                <w:sz w:val="24"/>
+                <w:szCs w:val="24"/>
+              </w:rPr>
+              <w:t xml:space="preserve">with the summary matching the information stored in the </w:t>
+            </w:r>
+            <w:r>
+              <w:rPr>
+                <w:sz w:val="24"/>
+                <w:szCs w:val="24"/>
+              </w:rPr>
+              <w:t>Wikipedia page</w:t>
+            </w:r>
+            <w:r>
+              <w:rPr>
+                <w:sz w:val="24"/>
+                <w:szCs w:val="24"/>
+              </w:rPr>
+              <w:t>.</w:t>
+            </w:r>
+            <w:r>
+              <w:rPr>
+                <w:sz w:val="24"/>
+                <w:szCs w:val="24"/>
+              </w:rPr>
+              <w:t xml:space="preserve"> </w:t>
             </w:r>
           </w:p>
           <w:p>
@@ -1956,6 +2800,16 @@
         </w:tc>
       </w:tr>
     </w:tbl>
+    <w:p/>
+    <w:p/>
+    <w:p/>
+    <w:p/>
+    <w:p/>
+    <w:p/>
+    <w:p/>
+    <w:p/>
+    <w:p/>
+    <w:p/>
     <w:p/>
     <w:p>
       <w:pPr>
@@ -2359,11 +3213,13 @@
       </w:tr>
     </w:tbl>
     <w:p/>
+    <w:p/>
     <w:p>
       <w:pPr>
         <w:pStyle w:val="Heading1"/>
       </w:pPr>
       <w:r>
+        <w:lastRenderedPageBreak/>
         <w:t xml:space="preserve">5. </w:t>
       </w:r>
       <w:r>
@@ -2382,7 +3238,6 @@
         <w:spacing w:after="0"/>
       </w:pPr>
       <w:r>
-        <w:lastRenderedPageBreak/>
         <w:t xml:space="preserve">If you </w:t>
       </w:r>
       <w:proofErr w:type="gramStart"/>

</xml_diff>